<commit_message>
Regenerate Nano Banano diagrams with precise professional style and spelling fixes
</commit_message>
<xml_diff>
--- a/interim_report.docx
+++ b/interim_report.docx
@@ -525,7 +525,7 @@
               <a:graphicData uri="http://schemas.openxmlformats.org/drawingml/2006/picture">
                 <pic:pic>
                   <pic:nvPicPr>
-                    <pic:cNvPr descr="/Users/varun/Desktop/FYP_Project/Trading-Agent/results/pipeline_overview_1772344690319.png" id="20" name="Picture"/>
+                    <pic:cNvPr descr="/Users/varun/Desktop/FYP_Project/Trading-Agent/results/pipeline_overview_v3_1772354485571.png" id="20" name="Picture"/>
                     <pic:cNvPicPr>
                       <a:picLocks noChangeArrowheads="1" noChangeAspect="1"/>
                     </pic:cNvPicPr>
@@ -681,7 +681,7 @@
               <a:graphicData uri="http://schemas.openxmlformats.org/drawingml/2006/picture">
                 <pic:pic>
                   <pic:nvPicPr>
-                    <pic:cNvPr descr="/Users/varun/Desktop/FYP_Project/Trading-Agent/results/technical_workflow_1772345216266.png" id="23" name="Picture"/>
+                    <pic:cNvPr descr="/Users/varun/Desktop/FYP_Project/Trading-Agent/results/technical_workflow_v3_1772354500003.png" id="23" name="Picture"/>
                     <pic:cNvPicPr>
                       <a:picLocks noChangeArrowheads="1" noChangeAspect="1"/>
                     </pic:cNvPicPr>
@@ -936,7 +936,7 @@
               <a:graphicData uri="http://schemas.openxmlformats.org/drawingml/2006/picture">
                 <pic:pic>
                   <pic:nvPicPr>
-                    <pic:cNvPr descr="/Users/varun/Desktop/FYP_Project/Trading-Agent/results/sentiment_workflow_1772344722007.png" id="27" name="Picture"/>
+                    <pic:cNvPr descr="/Users/varun/Desktop/FYP_Project/Trading-Agent/results/sentiment_workflow_v3_1772354529761.png" id="27" name="Picture"/>
                     <pic:cNvPicPr>
                       <a:picLocks noChangeArrowheads="1" noChangeAspect="1"/>
                     </pic:cNvPicPr>
@@ -1068,7 +1068,7 @@
               <a:graphicData uri="http://schemas.openxmlformats.org/drawingml/2006/picture">
                 <pic:pic>
                   <pic:nvPicPr>
-                    <pic:cNvPr descr="/Users/varun/Desktop/FYP_Project/Trading-Agent/results/fundamentals_workflow_1772344749415.png" id="31" name="Picture"/>
+                    <pic:cNvPr descr="/Users/varun/Desktop/FYP_Project/Trading-Agent/results/fundamentals_workflow_v3_1772354631305.png" id="31" name="Picture"/>
                     <pic:cNvPicPr>
                       <a:picLocks noChangeArrowheads="1" noChangeAspect="1"/>
                     </pic:cNvPicPr>
@@ -1255,7 +1255,7 @@
               <a:graphicData uri="http://schemas.openxmlformats.org/drawingml/2006/picture">
                 <pic:pic>
                   <pic:nvPicPr>
-                    <pic:cNvPr descr="/Users/varun/Desktop/FYP_Project/Trading-Agent/results/trader_workflow_1772344782855.png" id="35" name="Picture"/>
+                    <pic:cNvPr descr="/Users/varun/Desktop/FYP_Project/Trading-Agent/results/trader_workflow_v3_1772354647563.png" id="35" name="Picture"/>
                     <pic:cNvPicPr>
                       <a:picLocks noChangeArrowheads="1" noChangeAspect="1"/>
                     </pic:cNvPicPr>

</xml_diff>